<commit_message>
Update DOCX manuscript with pilot timing result
</commit_message>
<xml_diff>
--- a/docs/manuscript/GROMACS_Agent_manuscript_v1.docx
+++ b/docs/manuscript/GROMACS_Agent_manuscript_v1.docx
@@ -2,7 +2,7 @@
 <file path=word/document.xml><?xml version="1.0" encoding="utf-8"?>
 <w:document xmlns:w="http://schemas.openxmlformats.org/wordprocessingml/2006/main" xmlns:m="http://schemas.openxmlformats.org/officeDocument/2006/math" xmlns:r="http://schemas.openxmlformats.org/officeDocument/2006/relationships" xmlns:o="urn:schemas-microsoft-com:office:office" xmlns:v="urn:schemas-microsoft-com:vml" xmlns:w10="urn:schemas-microsoft-com:office:word" xmlns:a="http://schemas.openxmlformats.org/drawingml/2006/main" xmlns:pic="http://schemas.openxmlformats.org/drawingml/2006/picture" xmlns:wp="http://schemas.openxmlformats.org/drawingml/2006/wordprocessingDrawing">
   <w:body>
-    <w:bookmarkStart w:id="23" w:name="X508a459ffcffb6878ce1543a26e06e9adb0d711"/>
+    <w:bookmarkStart w:id="24" w:name="X508a459ffcffb6878ce1543a26e06e9adb0d711"/>
     <w:p>
       <w:pPr>
         <w:pStyle w:val="Heading1"/>
@@ -201,12 +201,430 @@
     </w:p>
     <w:bookmarkEnd w:id="18"/>
     <w:bookmarkEnd w:id="19"/>
-    <w:bookmarkStart w:id="20" w:name="discussion"/>
+    <w:bookmarkStart w:id="20" w:name="pilot-workflow-preparation-timing-study"/>
     <w:p>
       <w:pPr>
         <w:pStyle w:val="Heading2"/>
       </w:pPr>
       <w:r>
+        <w:t xml:space="preserve">Pilot workflow-preparation timing study</w:t>
+      </w:r>
+    </w:p>
+    <w:p>
+      <w:pPr>
+        <w:pStyle w:val="FirstParagraph"/>
+      </w:pPr>
+      <w:r>
+        <w:t xml:space="preserve">A single-user pilot timing study was conducted to estimate the local workflow-preparation speed of GROMACS-Agent compared with manual workflow writing. Five representative GROMACS workflow tasks were evaluated, and each manual workflow was saved as text evidence during timing.</w:t>
+      </w:r>
+    </w:p>
+    <w:p>
+      <w:pPr>
+        <w:pStyle w:val="BodyText"/>
+      </w:pPr>
+      <w:r>
+        <w:t xml:space="preserve">The cleaned timing dataset contained 5 valid tasks. The average manual workflow-writing time was 47.04 s, whereas the average local GROMACS-Agent generation time was 0.0580 s. This corresponds to an average local workflow-preparation time reduction of 99.74% in this pilot test.</w:t>
+      </w:r>
+    </w:p>
+    <w:tbl>
+      <w:tblPr>
+        <w:tblStyle w:val="Table"/>
+        <w:tblW w:type="pct" w:w="5000"/>
+        <w:tblLayout w:type="fixed"/>
+        <w:tblLook w:firstRow="1" w:lastRow="0" w:firstColumn="0" w:lastColumn="0" w:noHBand="0" w:noVBand="0" w:val="0020"/>
+      </w:tblPr>
+      <w:tblGrid>
+        <w:gridCol w:w="1250"/>
+        <w:gridCol w:w="1667"/>
+        <w:gridCol w:w="1667"/>
+        <w:gridCol w:w="1667"/>
+        <w:gridCol w:w="1667"/>
+      </w:tblGrid>
+      <w:tr>
+        <w:trPr>
+          <w:tblHeader w:val="on"/>
+        </w:trPr>
+        <w:tc>
+          <w:tcPr/>
+          <w:p>
+            <w:pPr>
+              <w:pStyle w:val="Compact"/>
+            </w:pPr>
+            <w:r>
+              <w:t xml:space="preserve">Task</w:t>
+            </w:r>
+          </w:p>
+        </w:tc>
+        <w:tc>
+          <w:tcPr/>
+          <w:p>
+            <w:pPr>
+              <w:pStyle w:val="Compact"/>
+              <w:jc w:val="right"/>
+            </w:pPr>
+            <w:r>
+              <w:t xml:space="preserve">Manual time (s)</w:t>
+            </w:r>
+          </w:p>
+        </w:tc>
+        <w:tc>
+          <w:tcPr/>
+          <w:p>
+            <w:pPr>
+              <w:pStyle w:val="Compact"/>
+              <w:jc w:val="right"/>
+            </w:pPr>
+            <w:r>
+              <w:t xml:space="preserve">Agent time (s)</w:t>
+            </w:r>
+          </w:p>
+        </w:tc>
+        <w:tc>
+          <w:tcPr/>
+          <w:p>
+            <w:pPr>
+              <w:pStyle w:val="Compact"/>
+              <w:jc w:val="right"/>
+            </w:pPr>
+            <w:r>
+              <w:t xml:space="preserve">Reduction (%)</w:t>
+            </w:r>
+          </w:p>
+        </w:tc>
+        <w:tc>
+          <w:tcPr/>
+          <w:p>
+            <w:pPr>
+              <w:pStyle w:val="Compact"/>
+              <w:jc w:val="right"/>
+            </w:pPr>
+            <w:r>
+              <w:t xml:space="preserve">Manual word count</w:t>
+            </w:r>
+          </w:p>
+        </w:tc>
+      </w:tr>
+      <w:tr>
+        <w:tc>
+          <w:tcPr/>
+          <w:p>
+            <w:pPr>
+              <w:pStyle w:val="Compact"/>
+            </w:pPr>
+            <w:r>
+              <w:t xml:space="preserve">O-O RDF calculation</w:t>
+            </w:r>
+          </w:p>
+        </w:tc>
+        <w:tc>
+          <w:tcPr/>
+          <w:p>
+            <w:pPr>
+              <w:pStyle w:val="Compact"/>
+              <w:jc w:val="right"/>
+            </w:pPr>
+            <w:r>
+              <w:t xml:space="preserve">165.20</w:t>
+            </w:r>
+          </w:p>
+        </w:tc>
+        <w:tc>
+          <w:tcPr/>
+          <w:p>
+            <w:pPr>
+              <w:pStyle w:val="Compact"/>
+              <w:jc w:val="right"/>
+            </w:pPr>
+            <w:r>
+              <w:t xml:space="preserve">0.0600</w:t>
+            </w:r>
+          </w:p>
+        </w:tc>
+        <w:tc>
+          <w:tcPr/>
+          <w:p>
+            <w:pPr>
+              <w:pStyle w:val="Compact"/>
+              <w:jc w:val="right"/>
+            </w:pPr>
+            <w:r>
+              <w:t xml:space="preserve">99.96</w:t>
+            </w:r>
+          </w:p>
+        </w:tc>
+        <w:tc>
+          <w:tcPr/>
+          <w:p>
+            <w:pPr>
+              <w:pStyle w:val="Compact"/>
+              <w:jc w:val="right"/>
+            </w:pPr>
+            <w:r>
+              <w:t xml:space="preserve">181</w:t>
+            </w:r>
+          </w:p>
+        </w:tc>
+      </w:tr>
+      <w:tr>
+        <w:tc>
+          <w:tcPr/>
+          <w:p>
+            <w:pPr>
+              <w:pStyle w:val="Compact"/>
+            </w:pPr>
+            <w:r>
+              <w:t xml:space="preserve">Temperature time-series extraction</w:t>
+            </w:r>
+          </w:p>
+        </w:tc>
+        <w:tc>
+          <w:tcPr/>
+          <w:p>
+            <w:pPr>
+              <w:pStyle w:val="Compact"/>
+              <w:jc w:val="right"/>
+            </w:pPr>
+            <w:r>
+              <w:t xml:space="preserve">22.84</w:t>
+            </w:r>
+          </w:p>
+        </w:tc>
+        <w:tc>
+          <w:tcPr/>
+          <w:p>
+            <w:pPr>
+              <w:pStyle w:val="Compact"/>
+              <w:jc w:val="right"/>
+            </w:pPr>
+            <w:r>
+              <w:t xml:space="preserve">0.1100</w:t>
+            </w:r>
+          </w:p>
+        </w:tc>
+        <w:tc>
+          <w:tcPr/>
+          <w:p>
+            <w:pPr>
+              <w:pStyle w:val="Compact"/>
+              <w:jc w:val="right"/>
+            </w:pPr>
+            <w:r>
+              <w:t xml:space="preserve">99.52</w:t>
+            </w:r>
+          </w:p>
+        </w:tc>
+        <w:tc>
+          <w:tcPr/>
+          <w:p>
+            <w:pPr>
+              <w:pStyle w:val="Compact"/>
+              <w:jc w:val="right"/>
+            </w:pPr>
+            <w:r>
+              <w:t xml:space="preserve">134</w:t>
+            </w:r>
+          </w:p>
+        </w:tc>
+      </w:tr>
+      <w:tr>
+        <w:tc>
+          <w:tcPr/>
+          <w:p>
+            <w:pPr>
+              <w:pStyle w:val="Compact"/>
+            </w:pPr>
+            <w:r>
+              <w:t xml:space="preserve">Density calculation</w:t>
+            </w:r>
+          </w:p>
+        </w:tc>
+        <w:tc>
+          <w:tcPr/>
+          <w:p>
+            <w:pPr>
+              <w:pStyle w:val="Compact"/>
+              <w:jc w:val="right"/>
+            </w:pPr>
+            <w:r>
+              <w:t xml:space="preserve">15.55</w:t>
+            </w:r>
+          </w:p>
+        </w:tc>
+        <w:tc>
+          <w:tcPr/>
+          <w:p>
+            <w:pPr>
+              <w:pStyle w:val="Compact"/>
+              <w:jc w:val="right"/>
+            </w:pPr>
+            <w:r>
+              <w:t xml:space="preserve">0.0400</w:t>
+            </w:r>
+          </w:p>
+        </w:tc>
+        <w:tc>
+          <w:tcPr/>
+          <w:p>
+            <w:pPr>
+              <w:pStyle w:val="Compact"/>
+              <w:jc w:val="right"/>
+            </w:pPr>
+            <w:r>
+              <w:t xml:space="preserve">99.74</w:t>
+            </w:r>
+          </w:p>
+        </w:tc>
+        <w:tc>
+          <w:tcPr/>
+          <w:p>
+            <w:pPr>
+              <w:pStyle w:val="Compact"/>
+              <w:jc w:val="right"/>
+            </w:pPr>
+            <w:r>
+              <w:t xml:space="preserve">158</w:t>
+            </w:r>
+          </w:p>
+        </w:tc>
+      </w:tr>
+      <w:tr>
+        <w:tc>
+          <w:tcPr/>
+          <w:p>
+            <w:pPr>
+              <w:pStyle w:val="Compact"/>
+            </w:pPr>
+            <w:r>
+              <w:t xml:space="preserve">MSD and diffusion</w:t>
+            </w:r>
+          </w:p>
+        </w:tc>
+        <w:tc>
+          <w:tcPr/>
+          <w:p>
+            <w:pPr>
+              <w:pStyle w:val="Compact"/>
+              <w:jc w:val="right"/>
+            </w:pPr>
+            <w:r>
+              <w:t xml:space="preserve">16.68</w:t>
+            </w:r>
+          </w:p>
+        </w:tc>
+        <w:tc>
+          <w:tcPr/>
+          <w:p>
+            <w:pPr>
+              <w:pStyle w:val="Compact"/>
+              <w:jc w:val="right"/>
+            </w:pPr>
+            <w:r>
+              <w:t xml:space="preserve">0.0400</w:t>
+            </w:r>
+          </w:p>
+        </w:tc>
+        <w:tc>
+          <w:tcPr/>
+          <w:p>
+            <w:pPr>
+              <w:pStyle w:val="Compact"/>
+              <w:jc w:val="right"/>
+            </w:pPr>
+            <w:r>
+              <w:t xml:space="preserve">99.76</w:t>
+            </w:r>
+          </w:p>
+        </w:tc>
+        <w:tc>
+          <w:tcPr/>
+          <w:p>
+            <w:pPr>
+              <w:pStyle w:val="Compact"/>
+              <w:jc w:val="right"/>
+            </w:pPr>
+            <w:r>
+              <w:t xml:space="preserve">170</w:t>
+            </w:r>
+          </w:p>
+        </w:tc>
+      </w:tr>
+      <w:tr>
+        <w:tc>
+          <w:tcPr/>
+          <w:p>
+            <w:pPr>
+              <w:pStyle w:val="Compact"/>
+            </w:pPr>
+            <w:r>
+              <w:t xml:space="preserve">PBC trajectory preprocessing</w:t>
+            </w:r>
+          </w:p>
+        </w:tc>
+        <w:tc>
+          <w:tcPr/>
+          <w:p>
+            <w:pPr>
+              <w:pStyle w:val="Compact"/>
+              <w:jc w:val="right"/>
+            </w:pPr>
+            <w:r>
+              <w:t xml:space="preserve">14.94</w:t>
+            </w:r>
+          </w:p>
+        </w:tc>
+        <w:tc>
+          <w:tcPr/>
+          <w:p>
+            <w:pPr>
+              <w:pStyle w:val="Compact"/>
+              <w:jc w:val="right"/>
+            </w:pPr>
+            <w:r>
+              <w:t xml:space="preserve">0.0400</w:t>
+            </w:r>
+          </w:p>
+        </w:tc>
+        <w:tc>
+          <w:tcPr/>
+          <w:p>
+            <w:pPr>
+              <w:pStyle w:val="Compact"/>
+              <w:jc w:val="right"/>
+            </w:pPr>
+            <w:r>
+              <w:t xml:space="preserve">99.73</w:t>
+            </w:r>
+          </w:p>
+        </w:tc>
+        <w:tc>
+          <w:tcPr/>
+          <w:p>
+            <w:pPr>
+              <w:pStyle w:val="Compact"/>
+              <w:jc w:val="right"/>
+            </w:pPr>
+            <w:r>
+              <w:t xml:space="preserve">152</w:t>
+            </w:r>
+          </w:p>
+        </w:tc>
+      </w:tr>
+    </w:tbl>
+    <w:p>
+      <w:pPr>
+        <w:pStyle w:val="BodyText"/>
+      </w:pPr>
+      <w:r>
+        <w:t xml:space="preserve">This result is reported as a single-user pilot timing result. It measures local workflow preparation only and does not include full GROMACS simulation runtime, model fine-tuning runtime, or broader multi-user productivity testing.</w:t>
+      </w:r>
+    </w:p>
+    <w:bookmarkEnd w:id="20"/>
+    <w:bookmarkStart w:id="21" w:name="discussion"/>
+    <w:p>
+      <w:pPr>
+        <w:pStyle w:val="Heading2"/>
+      </w:pPr>
+      <w:r>
         <w:t xml:space="preserve">Discussion</w:t>
       </w:r>
     </w:p>
@@ -218,8 +636,8 @@
         <w:t xml:space="preserve">The results show that a GROMACS-specific multi-agent workflow can improve reproducibility and correctness compared with unassisted baseline LLM responses. The strongest improvements occurred for workflows where baseline responses produced topology-coordinate mismatches, incorrect molecule counting, unsafe or unclear PBC handling, or weak validation. By combining retrieval, structured workflow generation, rubric-based evaluation, correction, and selected execution, GROMACS-Agent reduces common GROMACS-specific workflow errors.</w:t>
       </w:r>
     </w:p>
-    <w:bookmarkEnd w:id="20"/>
-    <w:bookmarkStart w:id="21" w:name="limitations"/>
+    <w:bookmarkEnd w:id="21"/>
+    <w:bookmarkStart w:id="22" w:name="limitations"/>
     <w:p>
       <w:pPr>
         <w:pStyle w:val="Heading2"/>
@@ -236,8 +654,8 @@
         <w:t xml:space="preserve">The current version demonstrates evaluator-score improvement and selected safe execution. It does not yet claim a controlled human time-reduction percentage or full superiority over all external LLM baselines. Such claims require a controlled user study and broader model comparison.</w:t>
       </w:r>
     </w:p>
-    <w:bookmarkEnd w:id="21"/>
-    <w:bookmarkStart w:id="22" w:name="code-availability"/>
+    <w:bookmarkEnd w:id="22"/>
+    <w:bookmarkStart w:id="23" w:name="code-availability"/>
     <w:p>
       <w:pPr>
         <w:pStyle w:val="Heading2"/>
@@ -254,9 +672,9 @@
         <w:t xml:space="preserve">The source code, datasets, benchmark summaries, fine-tuning files, and documentation are available at: https://github.com/sohail-hyd/GROMACS-Agent</w:t>
       </w:r>
     </w:p>
-    <w:bookmarkEnd w:id="22"/>
     <w:bookmarkEnd w:id="23"/>
-    <w:bookmarkStart w:id="31" w:name="manuscript-tables-and-figure-captions"/>
+    <w:bookmarkEnd w:id="24"/>
+    <w:bookmarkStart w:id="32" w:name="manuscript-tables-and-figure-captions"/>
     <w:p>
       <w:pPr>
         <w:pStyle w:val="Heading1"/>
@@ -265,7 +683,7 @@
         <w:t xml:space="preserve">Manuscript tables and figure captions</w:t>
       </w:r>
     </w:p>
-    <w:bookmarkStart w:id="24" w:name="X462e963d32348cd914cf26142289b04799adf79"/>
+    <w:bookmarkStart w:id="25" w:name="X462e963d32348cd914cf26142289b04799adf79"/>
     <w:p>
       <w:pPr>
         <w:pStyle w:val="Heading2"/>
@@ -535,8 +953,8 @@
         </w:tc>
       </w:tr>
     </w:tbl>
-    <w:bookmarkEnd w:id="24"/>
-    <w:bookmarkStart w:id="25" w:name="table-2.-dataset-and-benchmark-summary"/>
+    <w:bookmarkEnd w:id="25"/>
+    <w:bookmarkStart w:id="26" w:name="table-2.-dataset-and-benchmark-summary"/>
     <w:p>
       <w:pPr>
         <w:pStyle w:val="Heading2"/>
@@ -809,8 +1227,8 @@
         </w:tc>
       </w:tr>
     </w:tbl>
-    <w:bookmarkEnd w:id="25"/>
-    <w:bookmarkStart w:id="26" w:name="Xef42a57d9097836ed59bf24d40ddf4e55370321"/>
+    <w:bookmarkEnd w:id="26"/>
+    <w:bookmarkStart w:id="27" w:name="Xef42a57d9097836ed59bf24d40ddf4e55370321"/>
     <w:p>
       <w:pPr>
         <w:pStyle w:val="Heading2"/>
@@ -1197,8 +1615,8 @@
         </w:tc>
       </w:tr>
     </w:tbl>
-    <w:bookmarkEnd w:id="26"/>
-    <w:bookmarkStart w:id="27" w:name="figure-1-caption"/>
+    <w:bookmarkEnd w:id="27"/>
+    <w:bookmarkStart w:id="28" w:name="figure-1-caption"/>
     <w:p>
       <w:pPr>
         <w:pStyle w:val="Heading2"/>
@@ -1215,8 +1633,8 @@
         <w:t xml:space="preserve">Figure 1. Overall architecture of GROMACS-Agent. The framework follows an MDAgent-style workflow in which ManagerAgent interprets the user task, PlannerAgent decomposes the workflow, Retriever identifies related GSCF examples, GromacsWorkerAgent generates a topology-aware workflow, GromacsEvaluatorAgent scores and corrects the workflow, and CodeExecutorAgent performs selected safe execution.</w:t>
       </w:r>
     </w:p>
-    <w:bookmarkEnd w:id="27"/>
-    <w:bookmarkStart w:id="28" w:name="figure-2-caption"/>
+    <w:bookmarkEnd w:id="28"/>
+    <w:bookmarkStart w:id="29" w:name="figure-2-caption"/>
     <w:p>
       <w:pPr>
         <w:pStyle w:val="Heading2"/>
@@ -1233,8 +1651,8 @@
         <w:t xml:space="preserve">Figure 2. GROMACS-Agent dataset construction and benchmark pipeline. The GSCF dataset supports workflow generation, while the GEQS dataset supports workflow scoring and correction. Both datasets are exported into supervised fine-tuning format for future Worker and Evaluator model training.</w:t>
       </w:r>
     </w:p>
-    <w:bookmarkEnd w:id="28"/>
-    <w:bookmarkStart w:id="29" w:name="figure-3-caption"/>
+    <w:bookmarkEnd w:id="29"/>
+    <w:bookmarkStart w:id="30" w:name="figure-3-caption"/>
     <w:p>
       <w:pPr>
         <w:pStyle w:val="Heading2"/>
@@ -1251,8 +1669,8 @@
         <w:t xml:space="preserve">Figure 3. Representative GROMACS-Agent benchmark results for five workflow tasks: O-O RDF calculation, temperature time-series extraction, density calculation, MSD/diffusion analysis, and PBC trajectory preprocessing. All five generated workflows were accepted with final evaluator scores of 10/10.</w:t>
       </w:r>
     </w:p>
-    <w:bookmarkEnd w:id="29"/>
-    <w:bookmarkStart w:id="30" w:name="figure-4-caption"/>
+    <w:bookmarkEnd w:id="30"/>
+    <w:bookmarkStart w:id="31" w:name="figure-4-caption"/>
     <w:p>
       <w:pPr>
         <w:pStyle w:val="Heading2"/>
@@ -1269,8 +1687,8 @@
         <w:t xml:space="preserve">Figure 4. Baseline LLM versus GROMACS-Agent comparison. Baseline LLM responses achieved an average score of 6.6/10, while GROMACS-Agent achieved 10/10 across the same five tasks, corresponding to an average evaluator-score improvement of +3.4 points.</w:t>
       </w:r>
     </w:p>
-    <w:bookmarkEnd w:id="30"/>
     <w:bookmarkEnd w:id="31"/>
+    <w:bookmarkEnd w:id="32"/>
     <w:sectPr>
       <w:footnotePr>
         <w:numRestart w:val="eachSect"/>

</xml_diff>

<commit_message>
Update DOCX manuscript with figures
</commit_message>
<xml_diff>
--- a/docs/manuscript/GROMACS_Agent_manuscript_v1.docx
+++ b/docs/manuscript/GROMACS_Agent_manuscript_v1.docx
@@ -2,7 +2,7 @@
 <file path=word/document.xml><?xml version="1.0" encoding="utf-8"?>
 <w:document xmlns:w="http://schemas.openxmlformats.org/wordprocessingml/2006/main" xmlns:m="http://schemas.openxmlformats.org/officeDocument/2006/math" xmlns:r="http://schemas.openxmlformats.org/officeDocument/2006/relationships" xmlns:o="urn:schemas-microsoft-com:office:office" xmlns:v="urn:schemas-microsoft-com:vml" xmlns:w10="urn:schemas-microsoft-com:office:word" xmlns:a="http://schemas.openxmlformats.org/drawingml/2006/main" xmlns:pic="http://schemas.openxmlformats.org/drawingml/2006/picture" xmlns:wp="http://schemas.openxmlformats.org/drawingml/2006/wordprocessingDrawing">
   <w:body>
-    <w:bookmarkStart w:id="24" w:name="X508a459ffcffb6878ce1543a26e06e9adb0d711"/>
+    <w:bookmarkStart w:id="41" w:name="X508a459ffcffb6878ce1543a26e06e9adb0d711"/>
     <w:p>
       <w:pPr>
         <w:pStyle w:val="Heading1"/>
@@ -619,12 +619,278 @@
       </w:r>
     </w:p>
     <w:bookmarkEnd w:id="20"/>
-    <w:bookmarkStart w:id="21" w:name="discussion"/>
+    <w:bookmarkStart w:id="37" w:name="manuscript-figures"/>
     <w:p>
       <w:pPr>
         <w:pStyle w:val="Heading2"/>
       </w:pPr>
       <w:r>
+        <w:t xml:space="preserve">Manuscript figures</w:t>
+      </w:r>
+    </w:p>
+    <w:p>
+      <w:pPr>
+        <w:pStyle w:val="CaptionedFigure"/>
+      </w:pPr>
+      <w:r>
+        <w:drawing>
+          <wp:inline>
+            <wp:extent cx="5334000" cy="3111500"/>
+            <wp:effectExtent b="0" l="0" r="0" t="0"/>
+            <wp:docPr descr="Figure 1. GROMACS-Agent architecture." title="" id="22" name="Picture"/>
+            <a:graphic>
+              <a:graphicData uri="http://schemas.openxmlformats.org/drawingml/2006/picture">
+                <pic:pic>
+                  <pic:nvPicPr>
+                    <pic:cNvPr descr="figures/figure_1_gromacs_agent_architecture.svg" id="23" name="Picture"/>
+                    <pic:cNvPicPr>
+                      <a:picLocks noChangeArrowheads="1" noChangeAspect="1"/>
+                    </pic:cNvPicPr>
+                  </pic:nvPicPr>
+                  <pic:blipFill>
+                    <a:blip r:embed="rId24">
+                      <a:extLst>
+                        <a:ext uri="{28A0092B-C50C-407E-A947-70E740481C1C}">
+                          <a14:useLocalDpi xmlns:a14="http://schemas.microsoft.com/office/drawing/2010/main" val="0"/>
+                        </a:ext>
+                        <a:ext uri="{96DAC541-7B7A-43D3-8B79-37D633B846F1}">
+                          <asvg:svgBlip xmlns:asvg="http://schemas.microsoft.com/office/drawing/2016/SVG/main" r:embed="rId21"/>
+                        </a:ext>
+                      </a:extLst>
+                    </a:blip>
+                    <a:stretch>
+                      <a:fillRect/>
+                    </a:stretch>
+                  </pic:blipFill>
+                  <pic:spPr bwMode="auto">
+                    <a:xfrm>
+                      <a:off x="0" y="0"/>
+                      <a:ext cx="5334000" cy="3111500"/>
+                    </a:xfrm>
+                    <a:prstGeom prst="rect">
+                      <a:avLst/>
+                    </a:prstGeom>
+                    <a:noFill/>
+                    <a:ln w="9525">
+                      <a:noFill/>
+                      <a:headEnd/>
+                      <a:tailEnd/>
+                    </a:ln>
+                  </pic:spPr>
+                </pic:pic>
+              </a:graphicData>
+            </a:graphic>
+          </wp:inline>
+        </w:drawing>
+      </w:r>
+    </w:p>
+    <w:p>
+      <w:pPr>
+        <w:pStyle w:val="ImageCaption"/>
+      </w:pPr>
+      <w:r>
+        <w:t xml:space="preserve">Figure 1. GROMACS-Agent architecture.</w:t>
+      </w:r>
+    </w:p>
+    <w:p>
+      <w:pPr>
+        <w:pStyle w:val="CaptionedFigure"/>
+      </w:pPr>
+      <w:r>
+        <w:drawing>
+          <wp:inline>
+            <wp:extent cx="5334000" cy="3111500"/>
+            <wp:effectExtent b="0" l="0" r="0" t="0"/>
+            <wp:docPr descr="Figure 2. Baseline LLM vs GROMACS-Agent scores." title="" id="26" name="Picture"/>
+            <a:graphic>
+              <a:graphicData uri="http://schemas.openxmlformats.org/drawingml/2006/picture">
+                <pic:pic>
+                  <pic:nvPicPr>
+                    <pic:cNvPr descr="figures/figure_2_baseline_vs_agent_scores.svg" id="27" name="Picture"/>
+                    <pic:cNvPicPr>
+                      <a:picLocks noChangeArrowheads="1" noChangeAspect="1"/>
+                    </pic:cNvPicPr>
+                  </pic:nvPicPr>
+                  <pic:blipFill>
+                    <a:blip r:embed="rId28">
+                      <a:extLst>
+                        <a:ext uri="{28A0092B-C50C-407E-A947-70E740481C1C}">
+                          <a14:useLocalDpi xmlns:a14="http://schemas.microsoft.com/office/drawing/2010/main" val="0"/>
+                        </a:ext>
+                        <a:ext uri="{96DAC541-7B7A-43D3-8B79-37D633B846F1}">
+                          <asvg:svgBlip xmlns:asvg="http://schemas.microsoft.com/office/drawing/2016/SVG/main" r:embed="rId25"/>
+                        </a:ext>
+                      </a:extLst>
+                    </a:blip>
+                    <a:stretch>
+                      <a:fillRect/>
+                    </a:stretch>
+                  </pic:blipFill>
+                  <pic:spPr bwMode="auto">
+                    <a:xfrm>
+                      <a:off x="0" y="0"/>
+                      <a:ext cx="5334000" cy="3111500"/>
+                    </a:xfrm>
+                    <a:prstGeom prst="rect">
+                      <a:avLst/>
+                    </a:prstGeom>
+                    <a:noFill/>
+                    <a:ln w="9525">
+                      <a:noFill/>
+                      <a:headEnd/>
+                      <a:tailEnd/>
+                    </a:ln>
+                  </pic:spPr>
+                </pic:pic>
+              </a:graphicData>
+            </a:graphic>
+          </wp:inline>
+        </w:drawing>
+      </w:r>
+    </w:p>
+    <w:p>
+      <w:pPr>
+        <w:pStyle w:val="ImageCaption"/>
+      </w:pPr>
+      <w:r>
+        <w:t xml:space="preserve">Figure 2. Baseline LLM vs GROMACS-Agent scores.</w:t>
+      </w:r>
+    </w:p>
+    <w:p>
+      <w:pPr>
+        <w:pStyle w:val="CaptionedFigure"/>
+      </w:pPr>
+      <w:r>
+        <w:drawing>
+          <wp:inline>
+            <wp:extent cx="5334000" cy="3111500"/>
+            <wp:effectExtent b="0" l="0" r="0" t="0"/>
+            <wp:docPr descr="Figure 3. Single-user pilot workflow-preparation time reduction." title="" id="30" name="Picture"/>
+            <a:graphic>
+              <a:graphicData uri="http://schemas.openxmlformats.org/drawingml/2006/picture">
+                <pic:pic>
+                  <pic:nvPicPr>
+                    <pic:cNvPr descr="figures/figure_3_pilot_time_reduction.svg" id="31" name="Picture"/>
+                    <pic:cNvPicPr>
+                      <a:picLocks noChangeArrowheads="1" noChangeAspect="1"/>
+                    </pic:cNvPicPr>
+                  </pic:nvPicPr>
+                  <pic:blipFill>
+                    <a:blip r:embed="rId32">
+                      <a:extLst>
+                        <a:ext uri="{28A0092B-C50C-407E-A947-70E740481C1C}">
+                          <a14:useLocalDpi xmlns:a14="http://schemas.microsoft.com/office/drawing/2010/main" val="0"/>
+                        </a:ext>
+                        <a:ext uri="{96DAC541-7B7A-43D3-8B79-37D633B846F1}">
+                          <asvg:svgBlip xmlns:asvg="http://schemas.microsoft.com/office/drawing/2016/SVG/main" r:embed="rId29"/>
+                        </a:ext>
+                      </a:extLst>
+                    </a:blip>
+                    <a:stretch>
+                      <a:fillRect/>
+                    </a:stretch>
+                  </pic:blipFill>
+                  <pic:spPr bwMode="auto">
+                    <a:xfrm>
+                      <a:off x="0" y="0"/>
+                      <a:ext cx="5334000" cy="3111500"/>
+                    </a:xfrm>
+                    <a:prstGeom prst="rect">
+                      <a:avLst/>
+                    </a:prstGeom>
+                    <a:noFill/>
+                    <a:ln w="9525">
+                      <a:noFill/>
+                      <a:headEnd/>
+                      <a:tailEnd/>
+                    </a:ln>
+                  </pic:spPr>
+                </pic:pic>
+              </a:graphicData>
+            </a:graphic>
+          </wp:inline>
+        </w:drawing>
+      </w:r>
+    </w:p>
+    <w:p>
+      <w:pPr>
+        <w:pStyle w:val="ImageCaption"/>
+      </w:pPr>
+      <w:r>
+        <w:t xml:space="preserve">Figure 3. Single-user pilot workflow-preparation time reduction.</w:t>
+      </w:r>
+    </w:p>
+    <w:p>
+      <w:pPr>
+        <w:pStyle w:val="CaptionedFigure"/>
+      </w:pPr>
+      <w:r>
+        <w:drawing>
+          <wp:inline>
+            <wp:extent cx="5334000" cy="3111500"/>
+            <wp:effectExtent b="0" l="0" r="0" t="0"/>
+            <wp:docPr descr="Figure 4. Dataset and benchmark summary." title="" id="34" name="Picture"/>
+            <a:graphic>
+              <a:graphicData uri="http://schemas.openxmlformats.org/drawingml/2006/picture">
+                <pic:pic>
+                  <pic:nvPicPr>
+                    <pic:cNvPr descr="figures/figure_4_dataset_benchmark_summary.svg" id="35" name="Picture"/>
+                    <pic:cNvPicPr>
+                      <a:picLocks noChangeArrowheads="1" noChangeAspect="1"/>
+                    </pic:cNvPicPr>
+                  </pic:nvPicPr>
+                  <pic:blipFill>
+                    <a:blip r:embed="rId36">
+                      <a:extLst>
+                        <a:ext uri="{28A0092B-C50C-407E-A947-70E740481C1C}">
+                          <a14:useLocalDpi xmlns:a14="http://schemas.microsoft.com/office/drawing/2010/main" val="0"/>
+                        </a:ext>
+                        <a:ext uri="{96DAC541-7B7A-43D3-8B79-37D633B846F1}">
+                          <asvg:svgBlip xmlns:asvg="http://schemas.microsoft.com/office/drawing/2016/SVG/main" r:embed="rId33"/>
+                        </a:ext>
+                      </a:extLst>
+                    </a:blip>
+                    <a:stretch>
+                      <a:fillRect/>
+                    </a:stretch>
+                  </pic:blipFill>
+                  <pic:spPr bwMode="auto">
+                    <a:xfrm>
+                      <a:off x="0" y="0"/>
+                      <a:ext cx="5334000" cy="3111500"/>
+                    </a:xfrm>
+                    <a:prstGeom prst="rect">
+                      <a:avLst/>
+                    </a:prstGeom>
+                    <a:noFill/>
+                    <a:ln w="9525">
+                      <a:noFill/>
+                      <a:headEnd/>
+                      <a:tailEnd/>
+                    </a:ln>
+                  </pic:spPr>
+                </pic:pic>
+              </a:graphicData>
+            </a:graphic>
+          </wp:inline>
+        </w:drawing>
+      </w:r>
+    </w:p>
+    <w:p>
+      <w:pPr>
+        <w:pStyle w:val="ImageCaption"/>
+      </w:pPr>
+      <w:r>
+        <w:t xml:space="preserve">Figure 4. Dataset and benchmark summary.</w:t>
+      </w:r>
+    </w:p>
+    <w:bookmarkEnd w:id="37"/>
+    <w:bookmarkStart w:id="38" w:name="discussion"/>
+    <w:p>
+      <w:pPr>
+        <w:pStyle w:val="Heading2"/>
+      </w:pPr>
+      <w:r>
         <w:t xml:space="preserve">Discussion</w:t>
       </w:r>
     </w:p>
@@ -636,8 +902,8 @@
         <w:t xml:space="preserve">The results show that a GROMACS-specific multi-agent workflow can improve reproducibility and correctness compared with unassisted baseline LLM responses. The strongest improvements occurred for workflows where baseline responses produced topology-coordinate mismatches, incorrect molecule counting, unsafe or unclear PBC handling, or weak validation. By combining retrieval, structured workflow generation, rubric-based evaluation, correction, and selected execution, GROMACS-Agent reduces common GROMACS-specific workflow errors.</w:t>
       </w:r>
     </w:p>
-    <w:bookmarkEnd w:id="21"/>
-    <w:bookmarkStart w:id="22" w:name="limitations"/>
+    <w:bookmarkEnd w:id="38"/>
+    <w:bookmarkStart w:id="39" w:name="limitations"/>
     <w:p>
       <w:pPr>
         <w:pStyle w:val="Heading2"/>
@@ -654,8 +920,8 @@
         <w:t xml:space="preserve">The current version demonstrates evaluator-score improvement and selected safe execution. It does not yet claim a controlled human time-reduction percentage or full superiority over all external LLM baselines. Such claims require a controlled user study and broader model comparison.</w:t>
       </w:r>
     </w:p>
-    <w:bookmarkEnd w:id="22"/>
-    <w:bookmarkStart w:id="23" w:name="code-availability"/>
+    <w:bookmarkEnd w:id="39"/>
+    <w:bookmarkStart w:id="40" w:name="code-availability"/>
     <w:p>
       <w:pPr>
         <w:pStyle w:val="Heading2"/>
@@ -672,9 +938,9 @@
         <w:t xml:space="preserve">The source code, datasets, benchmark summaries, fine-tuning files, and documentation are available at: https://github.com/sohail-hyd/GROMACS-Agent</w:t>
       </w:r>
     </w:p>
-    <w:bookmarkEnd w:id="23"/>
-    <w:bookmarkEnd w:id="24"/>
-    <w:bookmarkStart w:id="32" w:name="manuscript-tables-and-figure-captions"/>
+    <w:bookmarkEnd w:id="40"/>
+    <w:bookmarkEnd w:id="41"/>
+    <w:bookmarkStart w:id="49" w:name="manuscript-tables-and-figure-captions"/>
     <w:p>
       <w:pPr>
         <w:pStyle w:val="Heading1"/>
@@ -683,7 +949,7 @@
         <w:t xml:space="preserve">Manuscript tables and figure captions</w:t>
       </w:r>
     </w:p>
-    <w:bookmarkStart w:id="25" w:name="X462e963d32348cd914cf26142289b04799adf79"/>
+    <w:bookmarkStart w:id="42" w:name="X462e963d32348cd914cf26142289b04799adf79"/>
     <w:p>
       <w:pPr>
         <w:pStyle w:val="Heading2"/>
@@ -953,8 +1219,8 @@
         </w:tc>
       </w:tr>
     </w:tbl>
-    <w:bookmarkEnd w:id="25"/>
-    <w:bookmarkStart w:id="26" w:name="table-2.-dataset-and-benchmark-summary"/>
+    <w:bookmarkEnd w:id="42"/>
+    <w:bookmarkStart w:id="43" w:name="table-2.-dataset-and-benchmark-summary"/>
     <w:p>
       <w:pPr>
         <w:pStyle w:val="Heading2"/>
@@ -1227,8 +1493,8 @@
         </w:tc>
       </w:tr>
     </w:tbl>
-    <w:bookmarkEnd w:id="26"/>
-    <w:bookmarkStart w:id="27" w:name="Xef42a57d9097836ed59bf24d40ddf4e55370321"/>
+    <w:bookmarkEnd w:id="43"/>
+    <w:bookmarkStart w:id="44" w:name="Xef42a57d9097836ed59bf24d40ddf4e55370321"/>
     <w:p>
       <w:pPr>
         <w:pStyle w:val="Heading2"/>
@@ -1615,8 +1881,8 @@
         </w:tc>
       </w:tr>
     </w:tbl>
-    <w:bookmarkEnd w:id="27"/>
-    <w:bookmarkStart w:id="28" w:name="figure-1-caption"/>
+    <w:bookmarkEnd w:id="44"/>
+    <w:bookmarkStart w:id="45" w:name="figure-1-caption"/>
     <w:p>
       <w:pPr>
         <w:pStyle w:val="Heading2"/>
@@ -1633,8 +1899,8 @@
         <w:t xml:space="preserve">Figure 1. Overall architecture of GROMACS-Agent. The framework follows an MDAgent-style workflow in which ManagerAgent interprets the user task, PlannerAgent decomposes the workflow, Retriever identifies related GSCF examples, GromacsWorkerAgent generates a topology-aware workflow, GromacsEvaluatorAgent scores and corrects the workflow, and CodeExecutorAgent performs selected safe execution.</w:t>
       </w:r>
     </w:p>
-    <w:bookmarkEnd w:id="28"/>
-    <w:bookmarkStart w:id="29" w:name="figure-2-caption"/>
+    <w:bookmarkEnd w:id="45"/>
+    <w:bookmarkStart w:id="46" w:name="figure-2-caption"/>
     <w:p>
       <w:pPr>
         <w:pStyle w:val="Heading2"/>
@@ -1651,8 +1917,8 @@
         <w:t xml:space="preserve">Figure 2. GROMACS-Agent dataset construction and benchmark pipeline. The GSCF dataset supports workflow generation, while the GEQS dataset supports workflow scoring and correction. Both datasets are exported into supervised fine-tuning format for future Worker and Evaluator model training.</w:t>
       </w:r>
     </w:p>
-    <w:bookmarkEnd w:id="29"/>
-    <w:bookmarkStart w:id="30" w:name="figure-3-caption"/>
+    <w:bookmarkEnd w:id="46"/>
+    <w:bookmarkStart w:id="47" w:name="figure-3-caption"/>
     <w:p>
       <w:pPr>
         <w:pStyle w:val="Heading2"/>
@@ -1669,8 +1935,8 @@
         <w:t xml:space="preserve">Figure 3. Representative GROMACS-Agent benchmark results for five workflow tasks: O-O RDF calculation, temperature time-series extraction, density calculation, MSD/diffusion analysis, and PBC trajectory preprocessing. All five generated workflows were accepted with final evaluator scores of 10/10.</w:t>
       </w:r>
     </w:p>
-    <w:bookmarkEnd w:id="30"/>
-    <w:bookmarkStart w:id="31" w:name="figure-4-caption"/>
+    <w:bookmarkEnd w:id="47"/>
+    <w:bookmarkStart w:id="48" w:name="figure-4-caption"/>
     <w:p>
       <w:pPr>
         <w:pStyle w:val="Heading2"/>
@@ -1687,8 +1953,8 @@
         <w:t xml:space="preserve">Figure 4. Baseline LLM versus GROMACS-Agent comparison. Baseline LLM responses achieved an average score of 6.6/10, while GROMACS-Agent achieved 10/10 across the same five tasks, corresponding to an average evaluator-score improvement of +3.4 points.</w:t>
       </w:r>
     </w:p>
-    <w:bookmarkEnd w:id="31"/>
-    <w:bookmarkEnd w:id="32"/>
+    <w:bookmarkEnd w:id="48"/>
+    <w:bookmarkEnd w:id="49"/>
     <w:sectPr>
       <w:footnotePr>
         <w:numRestart w:val="eachSect"/>

</xml_diff>